<commit_message>
20260929 - update apaquarto
</commit_message>
<xml_diff>
--- a/_extensions/wjschne/apaquarto/apaquarto.docx
+++ b/_extensions/wjschne/apaquarto/apaquarto.docx
@@ -4,7 +4,7 @@
   <w:body>
     <w:p>
       <w:pPr>
-        <w:pStyle w:val="AbstractFirstParagraph"/>
+        <w:pStyle w:val="SubPanelNote"/>
       </w:pPr>
     </w:p>
     <w:sectPr>
@@ -14,7 +14,6 @@
       <w:footerReference w:type="default" r:id="rId11"/>
       <w:headerReference w:type="first" r:id="rId12"/>
       <w:footerReference w:type="first" r:id="rId13"/>
-      <!-- apaquarto-original-papersize: w:w="12240" w:h="15840" -->
       <w:pgSz w:w="12240" w:h="15840" w:code="1"/>
       <w:pgMar w:top="1440" w:right="1440" w:bottom="1440" w:left="1440" w:header="720" w:footer="720" w:gutter="0"/>
       <w:cols w:space="720"/>
@@ -1191,6 +1190,10 @@
     <w:uiPriority w:val="9"/>
     <w:unhideWhenUsed/>
     <w:qFormat/>
+    <w:rsid w:val="00780A8B"/>
+    <w:pPr>
+      <w:spacing w:line="240" w:lineRule="auto"/>
+    </w:pPr>
   </w:style>
   <w:style w:type="table" w:customStyle="1" w:styleId="Table">
     <w:name w:val="Table"/>
@@ -1795,7 +1798,6 @@
       <w:keepNext/>
       <w:keepLines/>
       <w:spacing w:line="480" w:lineRule="auto"/>
-      <w:outlineLvl w:val="0"/>
     </w:pPr>
     <w:rPr>
       <w:b/>
@@ -1996,6 +1998,70 @@
     <w:rPr>
       <w:szCs w:val="20"/>
     </w:rPr>
+  </w:style>
+  <w:style w:type="paragraph" w:customStyle="1" w:styleId="SubPanelNote">
+    <w:name w:val="SubPanelNote"/>
+    <w:basedOn w:val="FigureNote"/>
+    <w:link w:val="SubPanelNoteChar"/>
+    <w:qFormat/>
+    <w:rsid w:val="00BD5312"/>
+    <w:pPr>
+      <w:jc w:val="center"/>
+    </w:pPr>
+  </w:style>
+  <w:style w:type="character" w:customStyle="1" w:styleId="SubPanelNoteChar">
+    <w:name w:val="SubPanelNote Char"/>
+    <w:basedOn w:val="FigureNoteChar"/>
+    <w:link w:val="SubPanelNote"/>
+    <w:rsid w:val="00BD5312"/>
+  </w:style>
+  <w:style w:type="paragraph" w:customStyle="1" w:styleId="ApaUnlistedHeading1">
+    <w:name w:val="Apa Unlisted Heading 1"/>
+    <w:basedOn w:val="Heading1"/>
+    <w:qFormat/>
+    <w:pPr>
+      <w:outlineLvl w:val="9"/>
+    </w:pPr>
+  </w:style>
+  <w:style w:type="paragraph" w:customStyle="1" w:styleId="ApaUnlistedHeading2">
+    <w:name w:val="Apa Unlisted Heading 2"/>
+    <w:basedOn w:val="Heading2"/>
+    <w:qFormat/>
+    <w:pPr>
+      <w:outlineLvl w:val="9"/>
+    </w:pPr>
+  </w:style>
+  <w:style w:type="paragraph" w:customStyle="1" w:styleId="ApaUnlistedHeading3">
+    <w:name w:val="Apa Unlisted Heading 3"/>
+    <w:basedOn w:val="Heading3"/>
+    <w:qFormat/>
+    <w:pPr>
+      <w:outlineLvl w:val="9"/>
+    </w:pPr>
+  </w:style>
+  <w:style w:type="paragraph" w:customStyle="1" w:styleId="ApaUnlistedHeading4">
+    <w:name w:val="Apa Unlisted Heading 4"/>
+    <w:basedOn w:val="Heading4"/>
+    <w:qFormat/>
+    <w:pPr>
+      <w:outlineLvl w:val="9"/>
+    </w:pPr>
+  </w:style>
+  <w:style w:type="paragraph" w:customStyle="1" w:styleId="ApaUnlistedHeading5">
+    <w:name w:val="Apa Unlisted Heading 5"/>
+    <w:basedOn w:val="Heading5"/>
+    <w:qFormat/>
+    <w:pPr>
+      <w:outlineLvl w:val="9"/>
+    </w:pPr>
+  </w:style>
+  <w:style w:type="paragraph" w:customStyle="1" w:styleId="ApaUnlistedHeading6">
+    <w:name w:val="Apa Unlisted Heading 6"/>
+    <w:basedOn w:val="Heading6"/>
+    <w:qFormat/>
+    <w:pPr>
+      <w:outlineLvl w:val="9"/>
+    </w:pPr>
   </w:style>
 </w:styles>
 </file>
@@ -2100,13 +2166,17 @@
     <w:rsid w:val="004F6D10"/>
     <w:rsid w:val="005702F2"/>
     <w:rsid w:val="005B1707"/>
+    <w:rsid w:val="005C0DD9"/>
     <w:rsid w:val="0061553F"/>
     <w:rsid w:val="007139D3"/>
     <w:rsid w:val="00843AF0"/>
+    <w:rsid w:val="0088292B"/>
+    <w:rsid w:val="00AA6B78"/>
     <w:rsid w:val="00B139B1"/>
     <w:rsid w:val="00B34FB5"/>
     <w:rsid w:val="00CE12A2"/>
     <w:rsid w:val="00D34E1D"/>
+    <w:rsid w:val="00DE61F2"/>
     <w:rsid w:val="00E37D61"/>
     <w:rsid w:val="00FC515E"/>
   </w:rsids>

</xml_diff>

<commit_message>
20261015 - apaquarto updates
</commit_message>
<xml_diff>
--- a/_extensions/wjschne/apaquarto/apaquarto.docx
+++ b/_extensions/wjschne/apaquarto/apaquarto.docx
@@ -8,14 +8,12 @@
       </w:pPr>
     </w:p>
     <w:sectPr>
-      <w:headerReference w:type="even" r:id="rId8"/>
-      <w:headerReference w:type="default" r:id="rId9"/>
-      <w:footerReference w:type="even" r:id="rId10"/>
-      <w:footerReference w:type="default" r:id="rId11"/>
-      <w:headerReference w:type="first" r:id="rId12"/>
+      <!-- apaquarto-original-headers: <w:headerReference w:type="even" r:id="rId8"/><w:headerReference w:type="default" r:id="rId9"/><w:footerReference w:type="even" r:id="rId10"/><w:footerReference w:type="default" r:id="rId11"/><w:headerReference w:type="first" r:id="rId12"/> -->
       <w:footerReference w:type="first" r:id="rId13"/>
       <w:pgSz w:w="12240" w:h="15840" w:code="1"/>
       <w:pgMar w:top="1440" w:right="1440" w:bottom="1440" w:left="1440" w:header="720" w:footer="720" w:gutter="0"/>
+      <!-- apaquarto-original-pagenumbering:  -->
+      <w:pgNumType w:fmt="decimal" w:start="1"/>
       <w:cols w:space="720"/>
     </w:sectPr>
   </w:body>
@@ -53,10 +51,24 @@
 
 <file path=word/footer2.xml><?xml version="1.0" encoding="utf-8"?>
 <w:ftr xmlns:wpc="http://schemas.microsoft.com/office/word/2010/wordprocessingCanvas" xmlns:cx="http://schemas.microsoft.com/office/drawing/2014/chartex" xmlns:cx1="http://schemas.microsoft.com/office/drawing/2015/9/8/chartex" xmlns:cx2="http://schemas.microsoft.com/office/drawing/2015/10/21/chartex" xmlns:cx3="http://schemas.microsoft.com/office/drawing/2016/5/9/chartex" xmlns:cx4="http://schemas.microsoft.com/office/drawing/2016/5/10/chartex" xmlns:cx5="http://schemas.microsoft.com/office/drawing/2016/5/11/chartex" xmlns:cx6="http://schemas.microsoft.com/office/drawing/2016/5/12/chartex" xmlns:cx7="http://schemas.microsoft.com/office/drawing/2016/5/13/chartex" xmlns:cx8="http://schemas.microsoft.com/office/drawing/2016/5/14/chartex" xmlns:mc="http://schemas.openxmlformats.org/markup-compatibility/2006" xmlns:aink="http://schemas.microsoft.com/office/drawing/2016/ink" xmlns:am3d="http://schemas.microsoft.com/office/drawing/2017/model3d" xmlns:o="urn:schemas-microsoft-com:office:office" xmlns:oel="http://schemas.microsoft.com/office/2019/extlst" xmlns:r="http://schemas.openxmlformats.org/officeDocument/2006/relationships" xmlns:m="http://schemas.openxmlformats.org/officeDocument/2006/math" xmlns:v="urn:schemas-microsoft-com:vml" xmlns:wp14="http://schemas.microsoft.com/office/word/2010/wordprocessingDrawing" xmlns:wp="http://schemas.openxmlformats.org/drawingml/2006/wordprocessingDrawing" xmlns:w10="urn:schemas-microsoft-com:office:word" xmlns:w="http://schemas.openxmlformats.org/wordprocessingml/2006/main" xmlns:w14="http://schemas.microsoft.com/office/word/2010/wordml" xmlns:w15="http://schemas.microsoft.com/office/word/2012/wordml" xmlns:w16cex="http://schemas.microsoft.com/office/word/2018/wordml/cex" xmlns:w16cid="http://schemas.microsoft.com/office/word/2016/wordml/cid" xmlns:w16="http://schemas.microsoft.com/office/word/2018/wordml" xmlns:w16du="http://schemas.microsoft.com/office/word/2023/wordml/word16du" xmlns:w16sdtdh="http://schemas.microsoft.com/office/word/2020/wordml/sdtdatahash" xmlns:w16sdtfl="http://schemas.microsoft.com/office/word/2024/wordml/sdtformatlock" xmlns:w16se="http://schemas.microsoft.com/office/word/2015/wordml/symex" xmlns:wpg="http://schemas.microsoft.com/office/word/2010/wordprocessingGroup" xmlns:wpi="http://schemas.microsoft.com/office/word/2010/wordprocessingInk" xmlns:wne="http://schemas.microsoft.com/office/word/2006/wordml" xmlns:wps="http://schemas.microsoft.com/office/word/2010/wordprocessingShape" mc:Ignorable="w14 w15 w16se w16cid w16 w16cex w16sdtdh w16sdtfl w16du wp14">
+  <!-- apaquarto-original-footer: <w:p><w:pPr><w:pStyle w:val="Footer"/></w:pPr></w:p> -->
   <w:p>
     <w:pPr>
       <w:pStyle w:val="Footer"/>
-    </w:pPr>
+      <w:jc w:val="center"/>
+    </w:pPr>
+    <w:r>
+      <w:fldChar w:fldCharType="begin"/>
+    </w:r>
+    <w:r>
+      <w:instrText xml:space="preserve"> PAGE </w:instrText>
+    </w:r>
+    <w:r>
+      <w:fldChar w:fldCharType="separate"/>
+    </w:r>
+    <w:r>
+      <w:fldChar w:fldCharType="end"/>
+    </w:r>
   </w:p>
 </w:ftr>
 </file>
@@ -122,7 +134,7 @@
       </w:sdtPr>
       <w:sdtContent>
         <w:r>
-          <w:t xml:space="preserve">TEMPLATE FOR THE APAQUARTO EXTENSION</w:t>
+          <w:t xml:space="preserve">TYPOGRAPHY, TASSEOMANCY, AND BADMINTON</w:t>
         </w:r>
       </w:sdtContent>
     </w:sdt>
@@ -515,6 +527,10 @@
 
 <file path=word/styles.xml><?xml version="1.0" encoding="utf-8"?>
 <w:styles xmlns:mc="http://schemas.openxmlformats.org/markup-compatibility/2006" xmlns:r="http://schemas.openxmlformats.org/officeDocument/2006/relationships" xmlns:w="http://schemas.openxmlformats.org/wordprocessingml/2006/main" xmlns:w14="http://schemas.microsoft.com/office/word/2010/wordml" xmlns:w15="http://schemas.microsoft.com/office/word/2012/wordml" xmlns:w16cex="http://schemas.microsoft.com/office/word/2018/wordml/cex" xmlns:w16cid="http://schemas.microsoft.com/office/word/2016/wordml/cid" xmlns:w16="http://schemas.microsoft.com/office/word/2018/wordml" xmlns:w16du="http://schemas.microsoft.com/office/word/2023/wordml/word16du" xmlns:w16sdtdh="http://schemas.microsoft.com/office/word/2020/wordml/sdtdatahash" xmlns:w16sdtfl="http://schemas.microsoft.com/office/word/2024/wordml/sdtformatlock" xmlns:w16se="http://schemas.microsoft.com/office/word/2015/wordml/symex" mc:Ignorable="w14 w15 w16se w16cid w16 w16cex w16sdtdh w16sdtfl w16du">
+  <!-- apaquarto-original-pprBibliography: <w:ind w:left="720" w:hanging="720"/> -->
+  <!-- apaquarto-original-pprBlockText: <w:ind w:left="720" w:firstLine="0"/> -->
+  <!-- apaquarto-original-pprFootnoteText: <w:spacing w:line="240" w:lineRule="auto"/> -->
+  <!-- apaquarto-original-pprNextBlockText: <w:ind w:firstLine="720"/> -->
   <w:docDefaults>
     <w:rPrDefault>
       <w:rPr>
@@ -1168,6 +1184,7 @@
     <w:qFormat/>
     <w:rsid w:val="00CB7758"/>
     <w:pPr>
+      <w:spacing w:after="276" w:line="240" w:lineRule="auto"/>
       <w:ind w:left="720" w:hanging="720"/>
     </w:pPr>
   </w:style>
@@ -1179,9 +1196,10 @@
     <w:uiPriority w:val="9"/>
     <w:unhideWhenUsed/>
     <w:qFormat/>
-    <w:rsid w:val="0017682D"/>
-    <w:pPr>
-      <w:ind w:left="720" w:right="720" w:firstLine="0"/>
+    <w:rsid w:val="0056007C"/>
+    <w:pPr>
+      <w:spacing w:after="276" w:line="240" w:lineRule="auto"/>
+      <w:ind w:left="720" w:firstLine="0"/>
     </w:pPr>
   </w:style>
   <w:style w:type="paragraph" w:styleId="FootnoteText">
@@ -1192,7 +1210,8 @@
     <w:qFormat/>
     <w:rsid w:val="00780A8B"/>
     <w:pPr>
-      <w:spacing w:line="240" w:lineRule="auto"/>
+      <w:spacing w:after="276" w:line="240" w:lineRule="auto"/>
+      <w:ind w:firstLine="720"/>
     </w:pPr>
   </w:style>
   <w:style w:type="table" w:customStyle="1" w:styleId="Table">
@@ -1202,7 +1221,7 @@
     <w:qFormat/>
     <w:rsid w:val="00387689"/>
     <w:pPr>
-      <w:spacing w:before="60" w:after="60"/>
+      <w:spacing w:before="0" w:after="0"/>
     </w:pPr>
     <w:tblPr>
       <w:tblInd w:w="0" w:type="dxa"/>
@@ -1210,14 +1229,14 @@
         <w:bottom w:val="single" w:sz="4" w:space="0" w:color="auto"/>
       </w:tblBorders>
       <w:tblCellMar>
-        <w:top w:w="58" w:type="dxa"/>
+        <w:top w:w="138" w:type="dxa"/>
         <w:left w:w="58" w:type="dxa"/>
-        <w:bottom w:w="58" w:type="dxa"/>
+        <w:bottom w:w="138" w:type="dxa"/>
         <w:right w:w="58" w:type="dxa"/>
       </w:tblCellMar>
     </w:tblPr>
     <w:tcPr>
-      <w:vAlign w:val="center"/>
+      <w:vAlign w:val="top"/>
     </w:tcPr>
     <w:tblStylePr w:type="firstRow">
       <w:tblPr/>
@@ -1232,6 +1251,11 @@
           <w:tl2br w:val="nil"/>
           <w:tr2bl w:val="nil"/>
         </w:tcBorders>
+        <w:tcMar>
+          <w:top w:w="186" w:type="dxa"/>
+          <w:bottom w:w="138" w:type="dxa"/>
+        </w:tcMar>
+        <w:vAlign w:val="bottom"/>
       </w:tcPr>
     </w:tblStylePr>
   </w:style>
@@ -1259,7 +1283,7 @@
     <w:pPr>
       <w:keepNext/>
       <w:keepLines/>
-      <w:spacing w:after="120"/>
+      <w:spacing w:after="0"/>
     </w:pPr>
     <w:rPr>
       <w:i/>
@@ -1268,6 +1292,9 @@
   <w:style w:type="paragraph" w:customStyle="1" w:styleId="TableCaption">
     <w:name w:val="Table Caption"/>
     <w:basedOn w:val="Caption"/>
+    <w:pPr>
+      <w:spacing w:after="0"/>
+    </w:pPr>
   </w:style>
   <w:style w:type="paragraph" w:customStyle="1" w:styleId="ImageCaption">
     <w:name w:val="Image Caption"/>
@@ -1797,7 +1824,7 @@
     <w:pPr>
       <w:keepNext/>
       <w:keepLines/>
-      <w:spacing w:line="480" w:lineRule="auto"/>
+      <w:spacing w:before="552" w:line="480" w:lineRule="auto"/>
     </w:pPr>
     <w:rPr>
       <w:b/>
@@ -1825,7 +1852,7 @@
     <w:qFormat/>
     <w:rsid w:val="00A946AC"/>
     <w:pPr>
-      <w:spacing w:before="60"/>
+      <w:spacing w:before="260"/>
       <w:ind w:firstLine="0"/>
     </w:pPr>
   </w:style>
@@ -1864,7 +1891,7 @@
     <w:qFormat/>
     <w:rsid w:val="00C304F7"/>
     <w:pPr>
-      <w:spacing w:after="240"/>
+      <w:spacing w:after="0"/>
     </w:pPr>
   </w:style>
   <w:style w:type="character" w:customStyle="1" w:styleId="FigureWithoutNoteChar">
@@ -1893,7 +1920,7 @@
     <w:qFormat/>
     <w:rsid w:val="00BB3FEC"/>
     <w:pPr>
-      <w:spacing w:before="240"/>
+      <w:spacing w:before="552"/>
     </w:pPr>
   </w:style>
   <w:style w:type="character" w:customStyle="1" w:styleId="AfterWithoutNoteChar">
@@ -1925,6 +1952,7 @@
     <w:qFormat/>
     <w:rsid w:val="00065938"/>
     <w:pPr>
+      <w:spacing w:after="276" w:line="240" w:lineRule="auto"/>
       <w:ind w:firstLine="720"/>
     </w:pPr>
   </w:style>
@@ -1933,7 +1961,7 @@
     <w:basedOn w:val="BodyTextChar"/>
     <w:link w:val="BlockText"/>
     <w:uiPriority w:val="9"/>
-    <w:rsid w:val="00065938"/>
+    <w:rsid w:val="0056007C"/>
   </w:style>
   <w:style w:type="character" w:customStyle="1" w:styleId="NextBlockTextChar">
     <w:name w:val="NextBlockText Char"/>
@@ -2061,6 +2089,13 @@
     <w:qFormat/>
     <w:pPr>
       <w:outlineLvl w:val="9"/>
+    </w:pPr>
+  </w:style>
+  <w:style w:type="paragraph" w:customStyle="1" w:styleId="QuoteAttribution">
+    <w:name w:val="QuoteAttribution"/>
+    <w:basedOn w:val="BlockText"/>
+    <w:pPr>
+      <w:jc w:val="right"/>
     </w:pPr>
   </w:style>
 </w:styles>
@@ -2160,6 +2195,7 @@
     <w:rsid w:val="00221DB6"/>
     <w:rsid w:val="00266742"/>
     <w:rsid w:val="002E7A3C"/>
+    <w:rsid w:val="003106FC"/>
     <w:rsid w:val="003402EC"/>
     <w:rsid w:val="00440287"/>
     <w:rsid w:val="004739F0"/>
@@ -2168,6 +2204,7 @@
     <w:rsid w:val="005B1707"/>
     <w:rsid w:val="005C0DD9"/>
     <w:rsid w:val="0061553F"/>
+    <w:rsid w:val="006F54D0"/>
     <w:rsid w:val="007139D3"/>
     <w:rsid w:val="00843AF0"/>
     <w:rsid w:val="0088292B"/>

</xml_diff>